<commit_message>
bo sung tuan 02
</commit_message>
<xml_diff>
--- a/DangCongHuynh_22654611_Tuan02/DangCongHuynh_22654611_Bai01/DangCongHuynh_Bai01.docx
+++ b/DangCongHuynh_22654611_Tuan02/DangCongHuynh_22654611_Bai01/DangCongHuynh_Bai01.docx
@@ -52,10 +52,50 @@
       </w:r>
     </w:p>
     <w:p>
+      <w:r>
+        <w:drawing>
+          <wp:inline distT="0" distB="0" distL="0" distR="0" wp14:anchorId="4166D521" wp14:editId="210B2AA8">
+            <wp:extent cx="5378726" cy="4184865"/>
+            <wp:effectExtent l="0" t="0" r="0" b="6350"/>
+            <wp:docPr id="505762056" name="Picture 1"/>
+            <wp:cNvGraphicFramePr>
+              <a:graphicFrameLocks xmlns:a="http://schemas.openxmlformats.org/drawingml/2006/main" noChangeAspect="1"/>
+            </wp:cNvGraphicFramePr>
+            <a:graphic xmlns:a="http://schemas.openxmlformats.org/drawingml/2006/main">
+              <a:graphicData uri="http://schemas.openxmlformats.org/drawingml/2006/picture">
+                <pic:pic xmlns:pic="http://schemas.openxmlformats.org/drawingml/2006/picture">
+                  <pic:nvPicPr>
+                    <pic:cNvPr id="505762056" name=""/>
+                    <pic:cNvPicPr/>
+                  </pic:nvPicPr>
+                  <pic:blipFill>
+                    <a:blip r:embed="rId6"/>
+                    <a:stretch>
+                      <a:fillRect/>
+                    </a:stretch>
+                  </pic:blipFill>
+                  <pic:spPr>
+                    <a:xfrm>
+                      <a:off x="0" y="0"/>
+                      <a:ext cx="5378726" cy="4184865"/>
+                    </a:xfrm>
+                    <a:prstGeom prst="rect">
+                      <a:avLst/>
+                    </a:prstGeom>
+                  </pic:spPr>
+                </pic:pic>
+              </a:graphicData>
+            </a:graphic>
+          </wp:inline>
+        </w:drawing>
+      </w:r>
+    </w:p>
+    <w:p>
       <w:pPr>
         <w:pStyle w:val="Heading3"/>
       </w:pPr>
       <w:r>
+        <w:lastRenderedPageBreak/>
         <w:t>1.2 MessageQueue (Scalability – Async)</w:t>
       </w:r>
     </w:p>
@@ -72,6 +112,45 @@
     <w:p>
       <w:r>
         <w:t>Ý nghĩa kiến trúc: tách việc tiếp nhận request và xử lý nghiệp vụ nặng. Điều này giúp hệ thống chịu tải tốt hơn khi số lượng request tăng cao.</w:t>
+      </w:r>
+    </w:p>
+    <w:p>
+      <w:r>
+        <w:drawing>
+          <wp:inline distT="0" distB="0" distL="0" distR="0" wp14:anchorId="2B4517AF" wp14:editId="2047AF4D">
+            <wp:extent cx="5486400" cy="4674870"/>
+            <wp:effectExtent l="0" t="0" r="0" b="0"/>
+            <wp:docPr id="855784661" name="Picture 1"/>
+            <wp:cNvGraphicFramePr>
+              <a:graphicFrameLocks xmlns:a="http://schemas.openxmlformats.org/drawingml/2006/main" noChangeAspect="1"/>
+            </wp:cNvGraphicFramePr>
+            <a:graphic xmlns:a="http://schemas.openxmlformats.org/drawingml/2006/main">
+              <a:graphicData uri="http://schemas.openxmlformats.org/drawingml/2006/picture">
+                <pic:pic xmlns:pic="http://schemas.openxmlformats.org/drawingml/2006/picture">
+                  <pic:nvPicPr>
+                    <pic:cNvPr id="855784661" name=""/>
+                    <pic:cNvPicPr/>
+                  </pic:nvPicPr>
+                  <pic:blipFill>
+                    <a:blip r:embed="rId7"/>
+                    <a:stretch>
+                      <a:fillRect/>
+                    </a:stretch>
+                  </pic:blipFill>
+                  <pic:spPr>
+                    <a:xfrm>
+                      <a:off x="0" y="0"/>
+                      <a:ext cx="5486400" cy="4674870"/>
+                    </a:xfrm>
+                    <a:prstGeom prst="rect">
+                      <a:avLst/>
+                    </a:prstGeom>
+                  </pic:spPr>
+                </pic:pic>
+              </a:graphicData>
+            </a:graphic>
+          </wp:inline>
+        </w:drawing>
       </w:r>
     </w:p>
     <w:p>
@@ -98,6 +177,46 @@
       </w:r>
     </w:p>
     <w:p>
+      <w:r>
+        <w:lastRenderedPageBreak/>
+        <w:drawing>
+          <wp:inline distT="0" distB="0" distL="0" distR="0" wp14:anchorId="7F2FAC36" wp14:editId="62EE8D60">
+            <wp:extent cx="5162815" cy="4603987"/>
+            <wp:effectExtent l="0" t="0" r="0" b="6350"/>
+            <wp:docPr id="758733834" name="Picture 1"/>
+            <wp:cNvGraphicFramePr>
+              <a:graphicFrameLocks xmlns:a="http://schemas.openxmlformats.org/drawingml/2006/main" noChangeAspect="1"/>
+            </wp:cNvGraphicFramePr>
+            <a:graphic xmlns:a="http://schemas.openxmlformats.org/drawingml/2006/main">
+              <a:graphicData uri="http://schemas.openxmlformats.org/drawingml/2006/picture">
+                <pic:pic xmlns:pic="http://schemas.openxmlformats.org/drawingml/2006/picture">
+                  <pic:nvPicPr>
+                    <pic:cNvPr id="758733834" name=""/>
+                    <pic:cNvPicPr/>
+                  </pic:nvPicPr>
+                  <pic:blipFill>
+                    <a:blip r:embed="rId8"/>
+                    <a:stretch>
+                      <a:fillRect/>
+                    </a:stretch>
+                  </pic:blipFill>
+                  <pic:spPr>
+                    <a:xfrm>
+                      <a:off x="0" y="0"/>
+                      <a:ext cx="5162815" cy="4603987"/>
+                    </a:xfrm>
+                    <a:prstGeom prst="rect">
+                      <a:avLst/>
+                    </a:prstGeom>
+                  </pic:spPr>
+                </pic:pic>
+              </a:graphicData>
+            </a:graphic>
+          </wp:inline>
+        </w:drawing>
+      </w:r>
+    </w:p>
+    <w:p>
       <w:pPr>
         <w:pStyle w:val="Heading2"/>
       </w:pPr>
@@ -120,13 +239,52 @@
     </w:p>
     <w:p>
       <w:r>
-        <w:lastRenderedPageBreak/>
         <w:t>Phương thức get(key) kiểm tra dữ liệu còn hạn hay không. Nếu hết hạn, dữ liệu sẽ bị xóa.</w:t>
       </w:r>
     </w:p>
     <w:p>
       <w:r>
         <w:t>Ý nghĩa: giảm số lần truy vấn database. Ví dụ thực tế: một request có thể giảm từ 170ms xuống còn 7ms.</w:t>
+      </w:r>
+    </w:p>
+    <w:p>
+      <w:r>
+        <w:lastRenderedPageBreak/>
+        <w:drawing>
+          <wp:inline distT="0" distB="0" distL="0" distR="0" wp14:anchorId="7948695B" wp14:editId="69FECFE7">
+            <wp:extent cx="5042159" cy="5048509"/>
+            <wp:effectExtent l="0" t="0" r="6350" b="0"/>
+            <wp:docPr id="1369337613" name="Picture 1"/>
+            <wp:cNvGraphicFramePr>
+              <a:graphicFrameLocks xmlns:a="http://schemas.openxmlformats.org/drawingml/2006/main" noChangeAspect="1"/>
+            </wp:cNvGraphicFramePr>
+            <a:graphic xmlns:a="http://schemas.openxmlformats.org/drawingml/2006/main">
+              <a:graphicData uri="http://schemas.openxmlformats.org/drawingml/2006/picture">
+                <pic:pic xmlns:pic="http://schemas.openxmlformats.org/drawingml/2006/picture">
+                  <pic:nvPicPr>
+                    <pic:cNvPr id="1369337613" name=""/>
+                    <pic:cNvPicPr/>
+                  </pic:nvPicPr>
+                  <pic:blipFill>
+                    <a:blip r:embed="rId9"/>
+                    <a:stretch>
+                      <a:fillRect/>
+                    </a:stretch>
+                  </pic:blipFill>
+                  <pic:spPr>
+                    <a:xfrm>
+                      <a:off x="0" y="0"/>
+                      <a:ext cx="5042159" cy="5048509"/>
+                    </a:xfrm>
+                    <a:prstGeom prst="rect">
+                      <a:avLst/>
+                    </a:prstGeom>
+                  </pic:spPr>
+                </pic:pic>
+              </a:graphicData>
+            </a:graphic>
+          </wp:inline>
+        </w:drawing>
       </w:r>
     </w:p>
     <w:p>
@@ -150,6 +308,46 @@
     <w:p>
       <w:r>
         <w:t>Ý nghĩa: giảm chi phí tạo kết nối và tăng hiệu suất hệ thống.</w:t>
+      </w:r>
+    </w:p>
+    <w:p>
+      <w:r>
+        <w:lastRenderedPageBreak/>
+        <w:drawing>
+          <wp:inline distT="0" distB="0" distL="0" distR="0" wp14:anchorId="4244A12F" wp14:editId="5DE85D31">
+            <wp:extent cx="5213618" cy="5346975"/>
+            <wp:effectExtent l="0" t="0" r="6350" b="6350"/>
+            <wp:docPr id="1431112345" name="Picture 1"/>
+            <wp:cNvGraphicFramePr>
+              <a:graphicFrameLocks xmlns:a="http://schemas.openxmlformats.org/drawingml/2006/main" noChangeAspect="1"/>
+            </wp:cNvGraphicFramePr>
+            <a:graphic xmlns:a="http://schemas.openxmlformats.org/drawingml/2006/main">
+              <a:graphicData uri="http://schemas.openxmlformats.org/drawingml/2006/picture">
+                <pic:pic xmlns:pic="http://schemas.openxmlformats.org/drawingml/2006/picture">
+                  <pic:nvPicPr>
+                    <pic:cNvPr id="1431112345" name=""/>
+                    <pic:cNvPicPr/>
+                  </pic:nvPicPr>
+                  <pic:blipFill>
+                    <a:blip r:embed="rId10"/>
+                    <a:stretch>
+                      <a:fillRect/>
+                    </a:stretch>
+                  </pic:blipFill>
+                  <pic:spPr>
+                    <a:xfrm>
+                      <a:off x="0" y="0"/>
+                      <a:ext cx="5213618" cy="5346975"/>
+                    </a:xfrm>
+                    <a:prstGeom prst="rect">
+                      <a:avLst/>
+                    </a:prstGeom>
+                  </pic:spPr>
+                </pic:pic>
+              </a:graphicData>
+            </a:graphic>
+          </wp:inline>
+        </w:drawing>
       </w:r>
     </w:p>
     <w:p>
@@ -203,6 +401,7 @@
         <w:pStyle w:val="Heading2"/>
       </w:pPr>
       <w:r>
+        <w:lastRenderedPageBreak/>
         <w:t>3. SECURITY – BẢO MẬT</w:t>
       </w:r>
     </w:p>
@@ -267,7 +466,6 @@
     </w:p>
     <w:p>
       <w:r>
-        <w:lastRenderedPageBreak/>
         <w:t>Hàm hashPassword minh họa việc mã hóa mật khẩu (thực tế nên dùng bcrypt hoặc argon2).</w:t>
       </w:r>
     </w:p>

</xml_diff>